<commit_message>
MDAG - 4lab practika - 1 часть
</commit_message>
<xml_diff>
--- a/Python/practik.docx
+++ b/Python/practik.docx
@@ -43,8 +43,8 @@
         </w:rPr>
       </w:pPr>
       <w:r>
-        <w:object w:dxaOrig="8302" w:dyaOrig="3742">
-          <v:rect xmlns:o="urn:schemas-microsoft-com:office:office" xmlns:v="urn:schemas-microsoft-com:vml" id="rectole0000000000" style="width:415.100000pt;height:187.100000pt" o:preferrelative="t" o:ole="">
+        <w:object w:dxaOrig="8402" w:dyaOrig="3786">
+          <v:rect xmlns:o="urn:schemas-microsoft-com:office:office" xmlns:v="urn:schemas-microsoft-com:vml" id="rectole0000000000" style="width:420.100000pt;height:189.300000pt" o:preferrelative="t" o:ole="">
             <o:lock v:ext="edit"/>
             <v:imagedata xmlns:r="http://schemas.openxmlformats.org/officeDocument/2006/relationships" r:id="docRId1" o:title=""/>
           </v:rect>
@@ -108,8 +108,8 @@
         </w:rPr>
       </w:pPr>
       <w:r>
-        <w:object w:dxaOrig="8302" w:dyaOrig="3929">
-          <v:rect xmlns:o="urn:schemas-microsoft-com:office:office" xmlns:v="urn:schemas-microsoft-com:vml" id="rectole0000000001" style="width:415.100000pt;height:196.450000pt" o:preferrelative="t" o:ole="">
+        <w:object w:dxaOrig="8402" w:dyaOrig="3968">
+          <v:rect xmlns:o="urn:schemas-microsoft-com:office:office" xmlns:v="urn:schemas-microsoft-com:vml" id="rectole0000000001" style="width:420.100000pt;height:198.400000pt" o:preferrelative="t" o:ole="">
             <o:lock v:ext="edit"/>
             <v:imagedata xmlns:r="http://schemas.openxmlformats.org/officeDocument/2006/relationships" r:id="docRId3" o:title=""/>
           </v:rect>
@@ -158,8 +158,8 @@
         </w:rPr>
       </w:pPr>
       <w:r>
-        <w:object w:dxaOrig="8302" w:dyaOrig="3869">
-          <v:rect xmlns:o="urn:schemas-microsoft-com:office:office" xmlns:v="urn:schemas-microsoft-com:vml" id="rectole0000000002" style="width:415.100000pt;height:193.450000pt" o:preferrelative="t" o:ole="">
+        <w:object w:dxaOrig="8402" w:dyaOrig="3907">
+          <v:rect xmlns:o="urn:schemas-microsoft-com:office:office" xmlns:v="urn:schemas-microsoft-com:vml" id="rectole0000000002" style="width:420.100000pt;height:195.350000pt" o:preferrelative="t" o:ole="">
             <o:lock v:ext="edit"/>
             <v:imagedata xmlns:r="http://schemas.openxmlformats.org/officeDocument/2006/relationships" r:id="docRId5" o:title=""/>
           </v:rect>
@@ -208,8 +208,8 @@
         </w:rPr>
       </w:pPr>
       <w:r>
-        <w:object w:dxaOrig="8302" w:dyaOrig="5474">
-          <v:rect xmlns:o="urn:schemas-microsoft-com:office:office" xmlns:v="urn:schemas-microsoft-com:vml" id="rectole0000000003" style="width:415.100000pt;height:273.700000pt" o:preferrelative="t" o:ole="">
+        <w:object w:dxaOrig="8402" w:dyaOrig="5547">
+          <v:rect xmlns:o="urn:schemas-microsoft-com:office:office" xmlns:v="urn:schemas-microsoft-com:vml" id="rectole0000000003" style="width:420.100000pt;height:277.350000pt" o:preferrelative="t" o:ole="">
             <o:lock v:ext="edit"/>
             <v:imagedata xmlns:r="http://schemas.openxmlformats.org/officeDocument/2006/relationships" r:id="docRId7" o:title=""/>
           </v:rect>
@@ -258,8 +258,8 @@
         </w:rPr>
       </w:pPr>
       <w:r>
-        <w:object w:dxaOrig="8302" w:dyaOrig="5497">
-          <v:rect xmlns:o="urn:schemas-microsoft-com:office:office" xmlns:v="urn:schemas-microsoft-com:vml" id="rectole0000000004" style="width:415.100000pt;height:274.850000pt" o:preferrelative="t" o:ole="">
+        <w:object w:dxaOrig="8402" w:dyaOrig="5567">
+          <v:rect xmlns:o="urn:schemas-microsoft-com:office:office" xmlns:v="urn:schemas-microsoft-com:vml" id="rectole0000000004" style="width:420.100000pt;height:278.350000pt" o:preferrelative="t" o:ole="">
             <o:lock v:ext="edit"/>
             <v:imagedata xmlns:r="http://schemas.openxmlformats.org/officeDocument/2006/relationships" r:id="docRId9" o:title=""/>
           </v:rect>
@@ -308,8 +308,8 @@
         </w:rPr>
       </w:pPr>
       <w:r>
-        <w:object w:dxaOrig="8302" w:dyaOrig="5880">
-          <v:rect xmlns:o="urn:schemas-microsoft-com:office:office" xmlns:v="urn:schemas-microsoft-com:vml" id="rectole0000000005" style="width:415.100000pt;height:294.000000pt" o:preferrelative="t" o:ole="">
+        <w:object w:dxaOrig="8402" w:dyaOrig="5952">
+          <v:rect xmlns:o="urn:schemas-microsoft-com:office:office" xmlns:v="urn:schemas-microsoft-com:vml" id="rectole0000000005" style="width:420.100000pt;height:297.600000pt" o:preferrelative="t" o:ole="">
             <o:lock v:ext="edit"/>
             <v:imagedata xmlns:r="http://schemas.openxmlformats.org/officeDocument/2006/relationships" r:id="docRId11" o:title=""/>
           </v:rect>
@@ -358,8 +358,8 @@
         </w:rPr>
       </w:pPr>
       <w:r>
-        <w:object w:dxaOrig="8302" w:dyaOrig="5190">
-          <v:rect xmlns:o="urn:schemas-microsoft-com:office:office" xmlns:v="urn:schemas-microsoft-com:vml" id="rectole0000000006" style="width:415.100000pt;height:259.500000pt" o:preferrelative="t" o:ole="">
+        <w:object w:dxaOrig="8402" w:dyaOrig="5264">
+          <v:rect xmlns:o="urn:schemas-microsoft-com:office:office" xmlns:v="urn:schemas-microsoft-com:vml" id="rectole0000000006" style="width:420.100000pt;height:263.200000pt" o:preferrelative="t" o:ole="">
             <o:lock v:ext="edit"/>
             <v:imagedata xmlns:r="http://schemas.openxmlformats.org/officeDocument/2006/relationships" r:id="docRId13" o:title=""/>
           </v:rect>
@@ -408,8 +408,8 @@
         </w:rPr>
       </w:pPr>
       <w:r>
-        <w:object w:dxaOrig="8302" w:dyaOrig="5369">
-          <v:rect xmlns:o="urn:schemas-microsoft-com:office:office" xmlns:v="urn:schemas-microsoft-com:vml" id="rectole0000000007" style="width:415.100000pt;height:268.450000pt" o:preferrelative="t" o:ole="">
+        <w:object w:dxaOrig="8402" w:dyaOrig="5426">
+          <v:rect xmlns:o="urn:schemas-microsoft-com:office:office" xmlns:v="urn:schemas-microsoft-com:vml" id="rectole0000000007" style="width:420.100000pt;height:271.300000pt" o:preferrelative="t" o:ole="">
             <o:lock v:ext="edit"/>
             <v:imagedata xmlns:r="http://schemas.openxmlformats.org/officeDocument/2006/relationships" r:id="docRId15" o:title=""/>
           </v:rect>
@@ -458,8 +458,8 @@
         </w:rPr>
       </w:pPr>
       <w:r>
-        <w:object w:dxaOrig="8302" w:dyaOrig="4935">
-          <v:rect xmlns:o="urn:schemas-microsoft-com:office:office" xmlns:v="urn:schemas-microsoft-com:vml" id="rectole0000000008" style="width:415.100000pt;height:246.750000pt" o:preferrelative="t" o:ole="">
+        <w:object w:dxaOrig="8402" w:dyaOrig="5000">
+          <v:rect xmlns:o="urn:schemas-microsoft-com:office:office" xmlns:v="urn:schemas-microsoft-com:vml" id="rectole0000000008" style="width:420.100000pt;height:250.000000pt" o:preferrelative="t" o:ole="">
             <o:lock v:ext="edit"/>
             <v:imagedata xmlns:r="http://schemas.openxmlformats.org/officeDocument/2006/relationships" r:id="docRId17" o:title=""/>
           </v:rect>
@@ -523,8 +523,8 @@
         </w:rPr>
       </w:pPr>
       <w:r>
-        <w:object w:dxaOrig="8302" w:dyaOrig="5760">
-          <v:rect xmlns:o="urn:schemas-microsoft-com:office:office" xmlns:v="urn:schemas-microsoft-com:vml" id="rectole0000000009" style="width:415.100000pt;height:288.000000pt" o:preferrelative="t" o:ole="">
+        <w:object w:dxaOrig="8402" w:dyaOrig="5831">
+          <v:rect xmlns:o="urn:schemas-microsoft-com:office:office" xmlns:v="urn:schemas-microsoft-com:vml" id="rectole0000000009" style="width:420.100000pt;height:291.550000pt" o:preferrelative="t" o:ole="">
             <o:lock v:ext="edit"/>
             <v:imagedata xmlns:r="http://schemas.openxmlformats.org/officeDocument/2006/relationships" r:id="docRId19" o:title=""/>
           </v:rect>
@@ -573,8 +573,8 @@
         </w:rPr>
       </w:pPr>
       <w:r>
-        <w:object w:dxaOrig="8302" w:dyaOrig="5144">
-          <v:rect xmlns:o="urn:schemas-microsoft-com:office:office" xmlns:v="urn:schemas-microsoft-com:vml" id="rectole0000000010" style="width:415.100000pt;height:257.200000pt" o:preferrelative="t" o:ole="">
+        <w:object w:dxaOrig="8402" w:dyaOrig="5203">
+          <v:rect xmlns:o="urn:schemas-microsoft-com:office:office" xmlns:v="urn:schemas-microsoft-com:vml" id="rectole0000000010" style="width:420.100000pt;height:260.150000pt" o:preferrelative="t" o:ole="">
             <o:lock v:ext="edit"/>
             <v:imagedata xmlns:r="http://schemas.openxmlformats.org/officeDocument/2006/relationships" r:id="docRId21" o:title=""/>
           </v:rect>
@@ -638,14 +638,509 @@
         </w:rPr>
       </w:pPr>
       <w:r>
-        <w:object w:dxaOrig="8302" w:dyaOrig="5887">
-          <v:rect xmlns:o="urn:schemas-microsoft-com:office:office" xmlns:v="urn:schemas-microsoft-com:vml" id="rectole0000000011" style="width:415.100000pt;height:294.350000pt" o:preferrelative="t" o:ole="">
+        <w:object w:dxaOrig="8402" w:dyaOrig="5952">
+          <v:rect xmlns:o="urn:schemas-microsoft-com:office:office" xmlns:v="urn:schemas-microsoft-com:vml" id="rectole0000000011" style="width:420.100000pt;height:297.600000pt" o:preferrelative="t" o:ole="">
             <o:lock v:ext="edit"/>
             <v:imagedata xmlns:r="http://schemas.openxmlformats.org/officeDocument/2006/relationships" r:id="docRId23" o:title=""/>
           </v:rect>
           <o:OLEObject xmlns:r="http://schemas.openxmlformats.org/officeDocument/2006/relationships" xmlns:o="urn:schemas-microsoft-com:office:office" Type="Embed" ProgID="StaticDib" DrawAspect="Content" ObjectID="0000000011" ShapeID="rectole0000000011" r:id="docRId22"/>
         </w:object>
       </w:r>
+    </w:p>
+    <w:p>
+      <w:pPr>
+        <w:spacing w:before="0" w:after="200" w:line="240"/>
+        <w:ind w:right="0" w:left="0" w:firstLine="0"/>
+        <w:jc w:val="left"/>
+        <w:rPr>
+          <w:rFonts w:ascii="Calibri" w:hAnsi="Calibri" w:cs="Calibri" w:eastAsia="Calibri"/>
+          <w:color w:val="auto"/>
+          <w:spacing w:val="0"/>
+          <w:position w:val="0"/>
+          <w:sz w:val="22"/>
+          <w:shd w:fill="auto" w:val="clear"/>
+        </w:rPr>
+      </w:pPr>
+    </w:p>
+    <w:p>
+      <w:pPr>
+        <w:spacing w:before="0" w:after="200" w:line="240"/>
+        <w:ind w:right="0" w:left="0" w:firstLine="0"/>
+        <w:jc w:val="left"/>
+        <w:rPr>
+          <w:rFonts w:ascii="Calibri" w:hAnsi="Calibri" w:cs="Calibri" w:eastAsia="Calibri"/>
+          <w:color w:val="auto"/>
+          <w:spacing w:val="0"/>
+          <w:position w:val="0"/>
+          <w:sz w:val="22"/>
+          <w:shd w:fill="auto" w:val="clear"/>
+        </w:rPr>
+      </w:pPr>
+      <w:r>
+        <w:rPr>
+          <w:rFonts w:ascii="Calibri" w:hAnsi="Calibri" w:cs="Calibri" w:eastAsia="Calibri"/>
+          <w:color w:val="auto"/>
+          <w:spacing w:val="0"/>
+          <w:position w:val="0"/>
+          <w:sz w:val="22"/>
+          <w:shd w:fill="auto" w:val="clear"/>
+        </w:rPr>
+        <w:t xml:space="preserve">1.13</w:t>
+      </w:r>
+    </w:p>
+    <w:p>
+      <w:pPr>
+        <w:spacing w:before="0" w:after="200" w:line="240"/>
+        <w:ind w:right="0" w:left="0" w:firstLine="0"/>
+        <w:jc w:val="left"/>
+        <w:rPr>
+          <w:rFonts w:ascii="Calibri" w:hAnsi="Calibri" w:cs="Calibri" w:eastAsia="Calibri"/>
+          <w:color w:val="auto"/>
+          <w:spacing w:val="0"/>
+          <w:position w:val="0"/>
+          <w:sz w:val="22"/>
+          <w:shd w:fill="auto" w:val="clear"/>
+        </w:rPr>
+      </w:pPr>
+      <w:r>
+        <w:object w:dxaOrig="8302" w:dyaOrig="4589">
+          <v:rect xmlns:o="urn:schemas-microsoft-com:office:office" xmlns:v="urn:schemas-microsoft-com:vml" id="rectole0000000012" style="width:415.100000pt;height:229.450000pt" o:preferrelative="t" o:ole="">
+            <o:lock v:ext="edit"/>
+            <v:imagedata xmlns:r="http://schemas.openxmlformats.org/officeDocument/2006/relationships" r:id="docRId25" o:title=""/>
+          </v:rect>
+          <o:OLEObject xmlns:r="http://schemas.openxmlformats.org/officeDocument/2006/relationships" xmlns:o="urn:schemas-microsoft-com:office:office" Type="Embed" ProgID="StaticDib" DrawAspect="Content" ObjectID="0000000012" ShapeID="rectole0000000012" r:id="docRId24"/>
+        </w:object>
+      </w:r>
+    </w:p>
+    <w:p>
+      <w:pPr>
+        <w:spacing w:before="0" w:after="200" w:line="240"/>
+        <w:ind w:right="0" w:left="0" w:firstLine="0"/>
+        <w:jc w:val="left"/>
+        <w:rPr>
+          <w:rFonts w:ascii="Calibri" w:hAnsi="Calibri" w:cs="Calibri" w:eastAsia="Calibri"/>
+          <w:color w:val="auto"/>
+          <w:spacing w:val="0"/>
+          <w:position w:val="0"/>
+          <w:sz w:val="22"/>
+          <w:shd w:fill="auto" w:val="clear"/>
+        </w:rPr>
+      </w:pPr>
+    </w:p>
+    <w:p>
+      <w:pPr>
+        <w:spacing w:before="0" w:after="200" w:line="240"/>
+        <w:ind w:right="0" w:left="0" w:firstLine="0"/>
+        <w:jc w:val="left"/>
+        <w:rPr>
+          <w:rFonts w:ascii="Calibri" w:hAnsi="Calibri" w:cs="Calibri" w:eastAsia="Calibri"/>
+          <w:color w:val="auto"/>
+          <w:spacing w:val="0"/>
+          <w:position w:val="0"/>
+          <w:sz w:val="22"/>
+          <w:shd w:fill="auto" w:val="clear"/>
+        </w:rPr>
+      </w:pPr>
+      <w:r>
+        <w:rPr>
+          <w:rFonts w:ascii="Calibri" w:hAnsi="Calibri" w:cs="Calibri" w:eastAsia="Calibri"/>
+          <w:color w:val="auto"/>
+          <w:spacing w:val="0"/>
+          <w:position w:val="0"/>
+          <w:sz w:val="22"/>
+          <w:shd w:fill="auto" w:val="clear"/>
+        </w:rPr>
+        <w:t xml:space="preserve">1.14</w:t>
+      </w:r>
+    </w:p>
+    <w:p>
+      <w:pPr>
+        <w:spacing w:before="0" w:after="200" w:line="240"/>
+        <w:ind w:right="0" w:left="0" w:firstLine="0"/>
+        <w:jc w:val="left"/>
+        <w:rPr>
+          <w:rFonts w:ascii="Calibri" w:hAnsi="Calibri" w:cs="Calibri" w:eastAsia="Calibri"/>
+          <w:color w:val="auto"/>
+          <w:spacing w:val="0"/>
+          <w:position w:val="0"/>
+          <w:sz w:val="22"/>
+          <w:shd w:fill="auto" w:val="clear"/>
+        </w:rPr>
+      </w:pPr>
+      <w:r>
+        <w:object w:dxaOrig="8302" w:dyaOrig="4140">
+          <v:rect xmlns:o="urn:schemas-microsoft-com:office:office" xmlns:v="urn:schemas-microsoft-com:vml" id="rectole0000000013" style="width:415.100000pt;height:207.000000pt" o:preferrelative="t" o:ole="">
+            <o:lock v:ext="edit"/>
+            <v:imagedata xmlns:r="http://schemas.openxmlformats.org/officeDocument/2006/relationships" r:id="docRId27" o:title=""/>
+          </v:rect>
+          <o:OLEObject xmlns:r="http://schemas.openxmlformats.org/officeDocument/2006/relationships" xmlns:o="urn:schemas-microsoft-com:office:office" Type="Embed" ProgID="StaticDib" DrawAspect="Content" ObjectID="0000000013" ShapeID="rectole0000000013" r:id="docRId26"/>
+        </w:object>
+      </w:r>
+    </w:p>
+    <w:p>
+      <w:pPr>
+        <w:spacing w:before="0" w:after="200" w:line="240"/>
+        <w:ind w:right="0" w:left="0" w:firstLine="0"/>
+        <w:jc w:val="left"/>
+        <w:rPr>
+          <w:rFonts w:ascii="Calibri" w:hAnsi="Calibri" w:cs="Calibri" w:eastAsia="Calibri"/>
+          <w:color w:val="auto"/>
+          <w:spacing w:val="0"/>
+          <w:position w:val="0"/>
+          <w:sz w:val="22"/>
+          <w:shd w:fill="auto" w:val="clear"/>
+        </w:rPr>
+      </w:pPr>
+    </w:p>
+    <w:p>
+      <w:pPr>
+        <w:spacing w:before="0" w:after="200" w:line="240"/>
+        <w:ind w:right="0" w:left="0" w:firstLine="0"/>
+        <w:jc w:val="left"/>
+        <w:rPr>
+          <w:rFonts w:ascii="Calibri" w:hAnsi="Calibri" w:cs="Calibri" w:eastAsia="Calibri"/>
+          <w:color w:val="auto"/>
+          <w:spacing w:val="0"/>
+          <w:position w:val="0"/>
+          <w:sz w:val="22"/>
+          <w:shd w:fill="auto" w:val="clear"/>
+        </w:rPr>
+      </w:pPr>
+      <w:r>
+        <w:rPr>
+          <w:rFonts w:ascii="Calibri" w:hAnsi="Calibri" w:cs="Calibri" w:eastAsia="Calibri"/>
+          <w:color w:val="auto"/>
+          <w:spacing w:val="0"/>
+          <w:position w:val="0"/>
+          <w:sz w:val="22"/>
+          <w:shd w:fill="auto" w:val="clear"/>
+        </w:rPr>
+        <w:t xml:space="preserve">1.15</w:t>
+      </w:r>
+    </w:p>
+    <w:p>
+      <w:pPr>
+        <w:spacing w:before="0" w:after="200" w:line="240"/>
+        <w:ind w:right="0" w:left="0" w:firstLine="0"/>
+        <w:jc w:val="left"/>
+        <w:rPr>
+          <w:rFonts w:ascii="Calibri" w:hAnsi="Calibri" w:cs="Calibri" w:eastAsia="Calibri"/>
+          <w:color w:val="auto"/>
+          <w:spacing w:val="0"/>
+          <w:position w:val="0"/>
+          <w:sz w:val="22"/>
+          <w:shd w:fill="auto" w:val="clear"/>
+        </w:rPr>
+      </w:pPr>
+      <w:r>
+        <w:object w:dxaOrig="8302" w:dyaOrig="4350">
+          <v:rect xmlns:o="urn:schemas-microsoft-com:office:office" xmlns:v="urn:schemas-microsoft-com:vml" id="rectole0000000014" style="width:415.100000pt;height:217.500000pt" o:preferrelative="t" o:ole="">
+            <o:lock v:ext="edit"/>
+            <v:imagedata xmlns:r="http://schemas.openxmlformats.org/officeDocument/2006/relationships" r:id="docRId29" o:title=""/>
+          </v:rect>
+          <o:OLEObject xmlns:r="http://schemas.openxmlformats.org/officeDocument/2006/relationships" xmlns:o="urn:schemas-microsoft-com:office:office" Type="Embed" ProgID="StaticDib" DrawAspect="Content" ObjectID="0000000014" ShapeID="rectole0000000014" r:id="docRId28"/>
+        </w:object>
+      </w:r>
+    </w:p>
+    <w:p>
+      <w:pPr>
+        <w:spacing w:before="0" w:after="200" w:line="240"/>
+        <w:ind w:right="0" w:left="0" w:firstLine="0"/>
+        <w:jc w:val="left"/>
+        <w:rPr>
+          <w:rFonts w:ascii="Calibri" w:hAnsi="Calibri" w:cs="Calibri" w:eastAsia="Calibri"/>
+          <w:color w:val="auto"/>
+          <w:spacing w:val="0"/>
+          <w:position w:val="0"/>
+          <w:sz w:val="22"/>
+          <w:shd w:fill="auto" w:val="clear"/>
+        </w:rPr>
+      </w:pPr>
+    </w:p>
+    <w:p>
+      <w:pPr>
+        <w:spacing w:before="0" w:after="200" w:line="240"/>
+        <w:ind w:right="0" w:left="0" w:firstLine="0"/>
+        <w:jc w:val="left"/>
+        <w:rPr>
+          <w:rFonts w:ascii="Calibri" w:hAnsi="Calibri" w:cs="Calibri" w:eastAsia="Calibri"/>
+          <w:color w:val="auto"/>
+          <w:spacing w:val="0"/>
+          <w:position w:val="0"/>
+          <w:sz w:val="22"/>
+          <w:shd w:fill="auto" w:val="clear"/>
+        </w:rPr>
+      </w:pPr>
+      <w:r>
+        <w:rPr>
+          <w:rFonts w:ascii="Calibri" w:hAnsi="Calibri" w:cs="Calibri" w:eastAsia="Calibri"/>
+          <w:color w:val="auto"/>
+          <w:spacing w:val="0"/>
+          <w:position w:val="0"/>
+          <w:sz w:val="22"/>
+          <w:shd w:fill="auto" w:val="clear"/>
+        </w:rPr>
+        <w:t xml:space="preserve">1.16</w:t>
+      </w:r>
+    </w:p>
+    <w:p>
+      <w:pPr>
+        <w:spacing w:before="0" w:after="200" w:line="240"/>
+        <w:ind w:right="0" w:left="0" w:firstLine="0"/>
+        <w:jc w:val="left"/>
+        <w:rPr>
+          <w:rFonts w:ascii="Calibri" w:hAnsi="Calibri" w:cs="Calibri" w:eastAsia="Calibri"/>
+          <w:color w:val="auto"/>
+          <w:spacing w:val="0"/>
+          <w:position w:val="0"/>
+          <w:sz w:val="22"/>
+          <w:shd w:fill="auto" w:val="clear"/>
+        </w:rPr>
+      </w:pPr>
+      <w:r>
+        <w:object w:dxaOrig="8302" w:dyaOrig="4559">
+          <v:rect xmlns:o="urn:schemas-microsoft-com:office:office" xmlns:v="urn:schemas-microsoft-com:vml" id="rectole0000000015" style="width:415.100000pt;height:227.950000pt" o:preferrelative="t" o:ole="">
+            <o:lock v:ext="edit"/>
+            <v:imagedata xmlns:r="http://schemas.openxmlformats.org/officeDocument/2006/relationships" r:id="docRId31" o:title=""/>
+          </v:rect>
+          <o:OLEObject xmlns:r="http://schemas.openxmlformats.org/officeDocument/2006/relationships" xmlns:o="urn:schemas-microsoft-com:office:office" Type="Embed" ProgID="StaticDib" DrawAspect="Content" ObjectID="0000000015" ShapeID="rectole0000000015" r:id="docRId30"/>
+        </w:object>
+      </w:r>
+    </w:p>
+    <w:p>
+      <w:pPr>
+        <w:spacing w:before="0" w:after="200" w:line="240"/>
+        <w:ind w:right="0" w:left="0" w:firstLine="0"/>
+        <w:jc w:val="left"/>
+        <w:rPr>
+          <w:rFonts w:ascii="Calibri" w:hAnsi="Calibri" w:cs="Calibri" w:eastAsia="Calibri"/>
+          <w:color w:val="auto"/>
+          <w:spacing w:val="0"/>
+          <w:position w:val="0"/>
+          <w:sz w:val="22"/>
+          <w:shd w:fill="auto" w:val="clear"/>
+        </w:rPr>
+      </w:pPr>
+    </w:p>
+    <w:p>
+      <w:pPr>
+        <w:spacing w:before="0" w:after="200" w:line="240"/>
+        <w:ind w:right="0" w:left="0" w:firstLine="0"/>
+        <w:jc w:val="left"/>
+        <w:rPr>
+          <w:rFonts w:ascii="Calibri" w:hAnsi="Calibri" w:cs="Calibri" w:eastAsia="Calibri"/>
+          <w:color w:val="auto"/>
+          <w:spacing w:val="0"/>
+          <w:position w:val="0"/>
+          <w:sz w:val="22"/>
+          <w:shd w:fill="auto" w:val="clear"/>
+        </w:rPr>
+      </w:pPr>
+      <w:r>
+        <w:rPr>
+          <w:rFonts w:ascii="Calibri" w:hAnsi="Calibri" w:cs="Calibri" w:eastAsia="Calibri"/>
+          <w:color w:val="auto"/>
+          <w:spacing w:val="0"/>
+          <w:position w:val="0"/>
+          <w:sz w:val="22"/>
+          <w:shd w:fill="auto" w:val="clear"/>
+        </w:rPr>
+        <w:t xml:space="preserve">1.17</w:t>
+      </w:r>
+    </w:p>
+    <w:p>
+      <w:pPr>
+        <w:spacing w:before="0" w:after="200" w:line="240"/>
+        <w:ind w:right="0" w:left="0" w:firstLine="0"/>
+        <w:jc w:val="left"/>
+        <w:rPr>
+          <w:rFonts w:ascii="Calibri" w:hAnsi="Calibri" w:cs="Calibri" w:eastAsia="Calibri"/>
+          <w:color w:val="auto"/>
+          <w:spacing w:val="0"/>
+          <w:position w:val="0"/>
+          <w:sz w:val="22"/>
+          <w:shd w:fill="auto" w:val="clear"/>
+        </w:rPr>
+      </w:pPr>
+      <w:r>
+        <w:object w:dxaOrig="8302" w:dyaOrig="4199">
+          <v:rect xmlns:o="urn:schemas-microsoft-com:office:office" xmlns:v="urn:schemas-microsoft-com:vml" id="rectole0000000016" style="width:415.100000pt;height:209.950000pt" o:preferrelative="t" o:ole="">
+            <o:lock v:ext="edit"/>
+            <v:imagedata xmlns:r="http://schemas.openxmlformats.org/officeDocument/2006/relationships" r:id="docRId33" o:title=""/>
+          </v:rect>
+          <o:OLEObject xmlns:r="http://schemas.openxmlformats.org/officeDocument/2006/relationships" xmlns:o="urn:schemas-microsoft-com:office:office" Type="Embed" ProgID="StaticDib" DrawAspect="Content" ObjectID="0000000016" ShapeID="rectole0000000016" r:id="docRId32"/>
+        </w:object>
+      </w:r>
+    </w:p>
+    <w:p>
+      <w:pPr>
+        <w:spacing w:before="0" w:after="200" w:line="240"/>
+        <w:ind w:right="0" w:left="0" w:firstLine="0"/>
+        <w:jc w:val="left"/>
+        <w:rPr>
+          <w:rFonts w:ascii="Calibri" w:hAnsi="Calibri" w:cs="Calibri" w:eastAsia="Calibri"/>
+          <w:color w:val="auto"/>
+          <w:spacing w:val="0"/>
+          <w:position w:val="0"/>
+          <w:sz w:val="22"/>
+          <w:shd w:fill="auto" w:val="clear"/>
+        </w:rPr>
+      </w:pPr>
+    </w:p>
+    <w:p>
+      <w:pPr>
+        <w:spacing w:before="0" w:after="200" w:line="240"/>
+        <w:ind w:right="0" w:left="0" w:firstLine="0"/>
+        <w:jc w:val="left"/>
+        <w:rPr>
+          <w:rFonts w:ascii="Calibri" w:hAnsi="Calibri" w:cs="Calibri" w:eastAsia="Calibri"/>
+          <w:color w:val="auto"/>
+          <w:spacing w:val="0"/>
+          <w:position w:val="0"/>
+          <w:sz w:val="22"/>
+          <w:shd w:fill="auto" w:val="clear"/>
+        </w:rPr>
+      </w:pPr>
+      <w:r>
+        <w:rPr>
+          <w:rFonts w:ascii="Calibri" w:hAnsi="Calibri" w:cs="Calibri" w:eastAsia="Calibri"/>
+          <w:color w:val="auto"/>
+          <w:spacing w:val="0"/>
+          <w:position w:val="0"/>
+          <w:sz w:val="22"/>
+          <w:shd w:fill="auto" w:val="clear"/>
+        </w:rPr>
+        <w:t xml:space="preserve">1.18</w:t>
+      </w:r>
+    </w:p>
+    <w:p>
+      <w:pPr>
+        <w:spacing w:before="0" w:after="200" w:line="240"/>
+        <w:ind w:right="0" w:left="0" w:firstLine="0"/>
+        <w:jc w:val="left"/>
+        <w:rPr>
+          <w:rFonts w:ascii="Calibri" w:hAnsi="Calibri" w:cs="Calibri" w:eastAsia="Calibri"/>
+          <w:color w:val="auto"/>
+          <w:spacing w:val="0"/>
+          <w:position w:val="0"/>
+          <w:sz w:val="22"/>
+          <w:shd w:fill="auto" w:val="clear"/>
+        </w:rPr>
+      </w:pPr>
+      <w:r>
+        <w:object w:dxaOrig="8302" w:dyaOrig="4440">
+          <v:rect xmlns:o="urn:schemas-microsoft-com:office:office" xmlns:v="urn:schemas-microsoft-com:vml" id="rectole0000000017" style="width:415.100000pt;height:222.000000pt" o:preferrelative="t" o:ole="">
+            <o:lock v:ext="edit"/>
+            <v:imagedata xmlns:r="http://schemas.openxmlformats.org/officeDocument/2006/relationships" r:id="docRId35" o:title=""/>
+          </v:rect>
+          <o:OLEObject xmlns:r="http://schemas.openxmlformats.org/officeDocument/2006/relationships" xmlns:o="urn:schemas-microsoft-com:office:office" Type="Embed" ProgID="StaticDib" DrawAspect="Content" ObjectID="0000000017" ShapeID="rectole0000000017" r:id="docRId34"/>
+        </w:object>
+      </w:r>
+    </w:p>
+    <w:p>
+      <w:pPr>
+        <w:spacing w:before="0" w:after="200" w:line="240"/>
+        <w:ind w:right="0" w:left="0" w:firstLine="0"/>
+        <w:jc w:val="left"/>
+        <w:rPr>
+          <w:rFonts w:ascii="Calibri" w:hAnsi="Calibri" w:cs="Calibri" w:eastAsia="Calibri"/>
+          <w:color w:val="auto"/>
+          <w:spacing w:val="0"/>
+          <w:position w:val="0"/>
+          <w:sz w:val="22"/>
+          <w:shd w:fill="auto" w:val="clear"/>
+        </w:rPr>
+      </w:pPr>
+    </w:p>
+    <w:p>
+      <w:pPr>
+        <w:spacing w:before="0" w:after="200" w:line="240"/>
+        <w:ind w:right="0" w:left="0" w:firstLine="0"/>
+        <w:jc w:val="left"/>
+        <w:rPr>
+          <w:rFonts w:ascii="Calibri" w:hAnsi="Calibri" w:cs="Calibri" w:eastAsia="Calibri"/>
+          <w:color w:val="auto"/>
+          <w:spacing w:val="0"/>
+          <w:position w:val="0"/>
+          <w:sz w:val="22"/>
+          <w:shd w:fill="auto" w:val="clear"/>
+        </w:rPr>
+      </w:pPr>
+    </w:p>
+    <w:p>
+      <w:pPr>
+        <w:spacing w:before="0" w:after="200" w:line="240"/>
+        <w:ind w:right="0" w:left="0" w:firstLine="0"/>
+        <w:jc w:val="left"/>
+        <w:rPr>
+          <w:rFonts w:ascii="Calibri" w:hAnsi="Calibri" w:cs="Calibri" w:eastAsia="Calibri"/>
+          <w:color w:val="auto"/>
+          <w:spacing w:val="0"/>
+          <w:position w:val="0"/>
+          <w:sz w:val="22"/>
+          <w:shd w:fill="auto" w:val="clear"/>
+        </w:rPr>
+      </w:pPr>
+    </w:p>
+    <w:p>
+      <w:pPr>
+        <w:spacing w:before="0" w:after="200" w:line="240"/>
+        <w:ind w:right="0" w:left="0" w:firstLine="0"/>
+        <w:jc w:val="left"/>
+        <w:rPr>
+          <w:rFonts w:ascii="Calibri" w:hAnsi="Calibri" w:cs="Calibri" w:eastAsia="Calibri"/>
+          <w:color w:val="auto"/>
+          <w:spacing w:val="0"/>
+          <w:position w:val="0"/>
+          <w:sz w:val="22"/>
+          <w:shd w:fill="auto" w:val="clear"/>
+        </w:rPr>
+      </w:pPr>
+    </w:p>
+    <w:p>
+      <w:pPr>
+        <w:spacing w:before="0" w:after="200" w:line="240"/>
+        <w:ind w:right="0" w:left="0" w:firstLine="0"/>
+        <w:jc w:val="left"/>
+        <w:rPr>
+          <w:rFonts w:ascii="Calibri" w:hAnsi="Calibri" w:cs="Calibri" w:eastAsia="Calibri"/>
+          <w:color w:val="auto"/>
+          <w:spacing w:val="0"/>
+          <w:position w:val="0"/>
+          <w:sz w:val="22"/>
+          <w:shd w:fill="auto" w:val="clear"/>
+        </w:rPr>
+      </w:pPr>
+    </w:p>
+    <w:p>
+      <w:pPr>
+        <w:spacing w:before="0" w:after="200" w:line="240"/>
+        <w:ind w:right="0" w:left="0" w:firstLine="0"/>
+        <w:jc w:val="left"/>
+        <w:rPr>
+          <w:rFonts w:ascii="Calibri" w:hAnsi="Calibri" w:cs="Calibri" w:eastAsia="Calibri"/>
+          <w:color w:val="auto"/>
+          <w:spacing w:val="0"/>
+          <w:position w:val="0"/>
+          <w:sz w:val="22"/>
+          <w:shd w:fill="auto" w:val="clear"/>
+        </w:rPr>
+      </w:pPr>
+    </w:p>
+    <w:p>
+      <w:pPr>
+        <w:spacing w:before="0" w:after="200" w:line="240"/>
+        <w:ind w:right="0" w:left="0" w:firstLine="0"/>
+        <w:jc w:val="left"/>
+        <w:rPr>
+          <w:rFonts w:ascii="Calibri" w:hAnsi="Calibri" w:cs="Calibri" w:eastAsia="Calibri"/>
+          <w:color w:val="auto"/>
+          <w:spacing w:val="0"/>
+          <w:position w:val="0"/>
+          <w:sz w:val="22"/>
+          <w:shd w:fill="auto" w:val="clear"/>
+        </w:rPr>
+      </w:pPr>
     </w:p>
     <w:p>
       <w:pPr>

</xml_diff>